<commit_message>
bap10 reply-brief docx: Liberation Serif 14 pt (the typst face) via docx/reference.xml (it named EB Garamond, DEF-FONT-002); exact 31.4 pt body lines as typst; TOC and TOA page numbers from the multi-pass engine (rIdFtr footers, FORMBOOK_FINAL; FRBP 8014(a)(2)-(3)); cover rules as raw paragraphs; headings as typst; signature kept with the last paragraph; certificate names the face used, bordered check box; README no longer says EB Garamond; check.sh --engine docx 10 passed 0 failed (fb-595.63)
</commit_message>
<xml_diff>
--- a/courts/tenth-circuit/bankruptcy-appellate-panel/reply-brief/usage/OUTPUT-reply-brief.docx
+++ b/courts/tenth-circuit/bankruptcy-appellate-panel/reply-brief/usage/OUTPUT-reply-brief.docx
@@ -16,6 +16,11 @@
     </w:p>
     <w:p>
       <w:pPr>
+        <w:pStyle w:val="RuleDouble"/>
+      </w:pPr>
+    </w:p>
+    <w:p>
+      <w:pPr>
         <w:pStyle w:val="Centered"/>
       </w:pPr>
       <w:r>
@@ -28,6 +33,11 @@
     </w:p>
     <w:p>
       <w:pPr>
+        <w:pStyle w:val="RuleShort"/>
+      </w:pPr>
+    </w:p>
+    <w:p>
+      <w:pPr>
         <w:pStyle w:val="Centered"/>
       </w:pPr>
       <w:r>
@@ -36,7 +46,7 @@
     </w:p>
     <w:p>
       <w:pPr>
-        <w:pStyle w:val="IndentBlock"/>
+        <w:pStyle w:val="Designation"/>
       </w:pPr>
       <w:r>
         <w:t xml:space="preserve">Debtor.</w:t>
@@ -52,7 +62,7 @@
     </w:p>
     <w:p>
       <w:pPr>
-        <w:pStyle w:val="IndentBlock"/>
+        <w:pStyle w:val="Designation"/>
       </w:pPr>
       <w:r>
         <w:t xml:space="preserve">Appellant,</w:t>
@@ -76,7 +86,7 @@
     </w:p>
     <w:p>
       <w:pPr>
-        <w:pStyle w:val="IndentBlock"/>
+        <w:pStyle w:val="Designation"/>
       </w:pPr>
       <w:r>
         <w:t xml:space="preserve">Appellees.</w:t>
@@ -92,11 +102,21 @@
     </w:p>
     <w:p>
       <w:pPr>
+        <w:pStyle w:val="RuleShort"/>
+      </w:pPr>
+    </w:p>
+    <w:p>
+      <w:pPr>
         <w:pStyle w:val="Centered"/>
       </w:pPr>
       <w:r>
         <w:t xml:space="preserve">On Appeal from the United States Bankruptcy Court for the District of Example</w:t>
       </w:r>
+    </w:p>
+    <w:p>
+      <w:pPr>
+        <w:pStyle w:val="RuleShort"/>
+      </w:pPr>
     </w:p>
     <w:p>
       <w:pPr>
@@ -107,12 +127,17 @@
           <w:b/>
           <w:bCs/>
         </w:rPr>
-        <w:t xml:space="preserve">Reply Brief of Appellant Jane Doe</w:t>
-      </w:r>
-    </w:p>
-    <w:p>
-      <w:pPr>
-        <w:pStyle w:val="IndentBlock"/>
+        <w:t xml:space="preserve">REPLY BRIEF OF APPELLANT JANE DOE</w:t>
+      </w:r>
+    </w:p>
+    <w:p>
+      <w:pPr>
+        <w:pStyle w:val="RuleShort"/>
+      </w:pPr>
+    </w:p>
+    <w:p>
+      <w:pPr>
+        <w:pStyle w:val="Counsel"/>
       </w:pPr>
       <w:r>
         <w:t xml:space="preserve">PAT EXAMPLE</w:t>
@@ -120,7 +145,7 @@
     </w:p>
     <w:p>
       <w:pPr>
-        <w:pStyle w:val="IndentBlock"/>
+        <w:pStyle w:val="CounselLine"/>
       </w:pPr>
       <w:r>
         <w:rPr>
@@ -132,7 +157,7 @@
     </w:p>
     <w:p>
       <w:pPr>
-        <w:pStyle w:val="IndentBlock"/>
+        <w:pStyle w:val="CounselLine"/>
       </w:pPr>
       <w:r>
         <w:rPr>
@@ -144,7 +169,7 @@
     </w:p>
     <w:p>
       <w:pPr>
-        <w:pStyle w:val="IndentBlock"/>
+        <w:pStyle w:val="CounselLine"/>
       </w:pPr>
       <w:r>
         <w:rPr>
@@ -156,7 +181,7 @@
     </w:p>
     <w:p>
       <w:pPr>
-        <w:pStyle w:val="IndentBlock"/>
+        <w:pStyle w:val="CounselLine"/>
       </w:pPr>
       <w:r>
         <w:rPr>
@@ -168,7 +193,7 @@
     </w:p>
     <w:p>
       <w:pPr>
-        <w:pStyle w:val="IndentBlock"/>
+        <w:pStyle w:val="CounselLine"/>
       </w:pPr>
       <w:r>
         <w:rPr>
@@ -180,10 +205,21 @@
     </w:p>
     <w:p>
       <w:pPr>
+        <w:pStyle w:val="RuleDouble"/>
+      </w:pPr>
+    </w:p>
+    <w:p>
+      <w:pPr>
+        <w:pStyle w:val="SectionBreak"/>
         <w:sectPr>
+          <w:footerReference w:type="default" r:id="rIdFtrNone"/>
+          <w:footnotePr>
+            <w:numFmt w:val="decimal"/>
+            <w:numRestart w:val="continuous"/>
+          </w:footnotePr>
+          <w:type w:val="nextPage"/>
           <w:pgSz w:w="12240" w:h="15840"/>
           <w:pgMar w:top="1440" w:right="1440" w:bottom="1440" w:left="1440" w:header="720" w:footer="720" w:gutter="0"/>
-          <w:pgNumType w:fmt="decimal" w:start="1"/>
           <w:cols w:space="720"/>
         </w:sectPr>
       </w:pPr>
@@ -198,110 +234,178 @@
     </w:p>
     <w:p>
       <w:pPr>
-        <w:pStyle w:val="Right"/>
-      </w:pPr>
+        <w:pStyle w:val="RightHead"/>
+      </w:pPr>
+      <w:r>
+        <w:t xml:space="preserve">Page</w:t>
+      </w:r>
+    </w:p>
+    <w:p>
+      <w:pPr>
+        <w:pStyle w:val="TOCK0"/>
+      </w:pPr>
+      <w:r>
+        <w:t xml:space="preserve">TABLE OF AUTHORITIES</w:t>
+      </w:r>
+      <w:r>
+        <w:t xml:space="preserve"> </w:t>
+      </w:r>
+      <w:r>
+        <w:tab/>
+      </w:r>
+      <w:r>
+        <w:t xml:space="preserve">ii</w:t>
+      </w:r>
+    </w:p>
+    <w:p>
+      <w:pPr>
+        <w:pStyle w:val="TOCK0"/>
+      </w:pPr>
+      <w:r>
+        <w:t xml:space="preserve">ARGUMENT</w:t>
+      </w:r>
+      <w:r>
+        <w:t xml:space="preserve"> </w:t>
+      </w:r>
+      <w:r>
+        <w:tab/>
+      </w:r>
+      <w:r>
+        <w:t xml:space="preserve">1</w:t>
+      </w:r>
+    </w:p>
+    <w:p>
+      <w:pPr>
+        <w:pStyle w:val="TOCK0"/>
+      </w:pPr>
+      <w:r>
+        <w:t xml:space="preserve">I.</w:t>
+      </w:r>
+      <w:r>
+        <w:tab/>
+      </w:r>
+      <w:r>
+        <w:t xml:space="preserve">THE APPELLEES DO NOT ANSWER THE VALUATION POINT</w:t>
+      </w:r>
+      <w:r>
+        <w:t xml:space="preserve"> </w:t>
+      </w:r>
+      <w:r>
+        <w:tab/>
+      </w:r>
+      <w:r>
+        <w:t xml:space="preserve">1</w:t>
+      </w:r>
+    </w:p>
+    <w:p>
+      <w:pPr>
+        <w:pStyle w:val="TOCK0"/>
+      </w:pPr>
+      <w:r>
+        <w:t xml:space="preserve">II.</w:t>
+      </w:r>
+      <w:r>
+        <w:tab/>
+      </w:r>
+      <w:r>
+        <w:t xml:space="preserve">THE PROCEEDS PROVISION IS A CONCESSION, NOT A REMEDY</w:t>
+      </w:r>
+      <w:r>
+        <w:t xml:space="preserve"> </w:t>
+      </w:r>
+      <w:r>
+        <w:tab/>
+      </w:r>
+      <w:r>
+        <w:t xml:space="preserve">1</w:t>
+      </w:r>
+    </w:p>
+    <w:p>
+      <w:pPr>
+        <w:pStyle w:val="TOCK0"/>
+      </w:pPr>
+      <w:r>
+        <w:t xml:space="preserve">CONCLUSION</w:t>
+      </w:r>
+      <w:r>
+        <w:t xml:space="preserve"> </w:t>
+      </w:r>
+      <w:r>
+        <w:tab/>
+      </w:r>
+      <w:r>
+        <w:t xml:space="preserve">2</w:t>
+      </w:r>
+    </w:p>
+    <w:p>
+      <w:pPr>
+        <w:pStyle w:val="TOCK0"/>
+      </w:pPr>
+      <w:r>
+        <w:t xml:space="preserve">CERTIFICATE OF COMPLIANCE</w:t>
+      </w:r>
+      <w:r>
+        <w:t xml:space="preserve"> </w:t>
+      </w:r>
+      <w:r>
+        <w:tab/>
+      </w:r>
+      <w:r>
+        <w:t xml:space="preserve">3</w:t>
+      </w:r>
+    </w:p>
+    <w:p>
+      <w:pPr>
+        <w:pStyle w:val="FrontHeadingBreak"/>
+      </w:pPr>
+      <w:r>
+        <w:t xml:space="preserve">Table of Authorities</w:t>
+      </w:r>
+    </w:p>
+    <w:p>
+      <w:pPr>
+        <w:pStyle w:val="TOAGroup"/>
+      </w:pPr>
+      <w:r>
+        <w:t xml:space="preserve">Statutes:</w:t>
+      </w:r>
+      <w:r>
+        <w:tab/>
+      </w:r>
       <w:r>
         <w:rPr>
-          <w:b/>
-          <w:bCs/>
           <w:u w:val="single"/>
         </w:rPr>
-        <w:t xml:space="preserve">Page</w:t>
-      </w:r>
-    </w:p>
-    <w:p>
-      <w:pPr>
-        <w:pStyle w:val="TOCLine1"/>
-      </w:pPr>
-      <w:r>
-        <w:fldChar w:fldCharType="begin"/>
-      </w:r>
-      <w:r>
-        <w:instrText xml:space="preserve"> TOC \o "1-4" \h \z \u </w:instrText>
-      </w:r>
-      <w:r>
-        <w:fldChar w:fldCharType="separate"/>
-      </w:r>
-      <w:r>
-        <w:t xml:space="preserve">TABLE OF AUTHORITIES</w:t>
-      </w:r>
-    </w:p>
-    <w:p>
-      <w:pPr>
-        <w:pStyle w:val="TOCLine1"/>
-      </w:pPr>
-      <w:r>
-        <w:t xml:space="preserve">ARGUMENT</w:t>
-      </w:r>
-    </w:p>
-    <w:p>
-      <w:pPr>
-        <w:pStyle w:val="TOCLine2"/>
-      </w:pPr>
-      <w:r>
-        <w:t xml:space="preserve">I. THE APPELLEES DO NOT ANSWER THE VALUATION POINT</w:t>
-      </w:r>
-    </w:p>
-    <w:p>
-      <w:pPr>
-        <w:pStyle w:val="TOCLine2"/>
-      </w:pPr>
-      <w:r>
-        <w:t xml:space="preserve">II. THE PROCEEDS PROVISION IS A CONCESSION, NOT A REMEDY</w:t>
-      </w:r>
-    </w:p>
-    <w:p>
-      <w:pPr>
-        <w:pStyle w:val="TOCLine1"/>
-      </w:pPr>
-      <w:r>
-        <w:t xml:space="preserve">CONCLUSION</w:t>
-      </w:r>
-    </w:p>
-    <w:p>
-      <w:pPr>
-        <w:pStyle w:val="TOCLine1"/>
-      </w:pPr>
-      <w:r>
-        <w:t xml:space="preserve">CERTIFICATE OF COMPLIANCE</w:t>
-      </w:r>
-      <w:r>
-        <w:fldChar w:fldCharType="end"/>
-      </w:r>
-    </w:p>
-    <w:p>
-      <w:r>
-        <w:br w:type="page"/>
-      </w:r>
-    </w:p>
-    <w:p>
-      <w:pPr>
-        <w:pStyle w:val="Heading1"/>
-      </w:pPr>
-      <w:r>
-        <w:t xml:space="preserve">Table of Authorities</w:t>
-      </w:r>
-    </w:p>
-    <w:p>
-      <w:pPr>
-        <w:pStyle w:val="TOAGroup"/>
-      </w:pPr>
-      <w:r>
-        <w:t xml:space="preserve">Statutes:</w:t>
-      </w:r>
-    </w:p>
-    <w:p>
-      <w:pPr>
-        <w:pStyle w:val="TOAEntry"/>
+        <w:t xml:space="preserve">Page(s)</w:t>
+      </w:r>
+    </w:p>
+    <w:p>
+      <w:pPr>
+        <w:pStyle w:val="TOALine"/>
       </w:pPr>
       <w:r>
         <w:t xml:space="preserve">11 U.S.C. § 363 (2024)</w:t>
       </w:r>
-    </w:p>
-    <w:p>
-      <w:pPr>
+      <w:r>
+        <w:t xml:space="preserve"> </w:t>
+      </w:r>
+      <w:r>
+        <w:tab/>
+      </w:r>
+      <w:r>
+        <w:t xml:space="preserve">1</w:t>
+      </w:r>
+    </w:p>
+    <w:p>
+      <w:pPr>
+        <w:pStyle w:val="SectionBreak"/>
         <w:sectPr>
-          <w:footerReference w:type="default" r:id="rId101"/>
+          <w:footerReference w:type="default" r:id="rIdFtrPage"/>
+          <w:footnotePr>
+            <w:numFmt w:val="decimal"/>
+            <w:numRestart w:val="continuous"/>
+          </w:footnotePr>
+          <w:type w:val="nextPage"/>
           <w:pgSz w:w="12240" w:h="15840"/>
           <w:pgMar w:top="1440" w:right="1440" w:bottom="1440" w:left="1440" w:header="720" w:footer="720" w:gutter="0"/>
           <w:pgNumType w:fmt="lowerRoman" w:start="1"/>
@@ -359,7 +463,7 @@
     </w:p>
     <w:p>
       <w:pPr>
-        <w:pStyle w:val="FirstParagraph"/>
+        <w:pStyle w:val="BodyKeep"/>
       </w:pPr>
       <w:r>
         <w:t xml:space="preserve">Appellant renews her request that the Panel vacate the sale order and remand for findings on value.</w:t>
@@ -367,7 +471,12 @@
     </w:p>
     <w:p>
       <w:pPr>
-        <w:pStyle w:val="Signature"/>
+        <w:pStyle w:val="Gap"/>
+      </w:pPr>
+    </w:p>
+    <w:p>
+      <w:pPr>
+        <w:pStyle w:val="Counsel"/>
       </w:pPr>
       <w:r>
         <w:t xml:space="preserve">Respectfully submitted,</w:t>
@@ -375,15 +484,20 @@
     </w:p>
     <w:p>
       <w:pPr>
-        <w:pStyle w:val="IndentBlock"/>
-      </w:pPr>
-      <w:r>
-        <w:t xml:space="preserve">/s/  Pat Example</w:t>
-      </w:r>
-    </w:p>
-    <w:p>
-      <w:pPr>
-        <w:pStyle w:val="IndentBlock"/>
+        <w:pStyle w:val="Gap"/>
+      </w:pPr>
+    </w:p>
+    <w:p>
+      <w:pPr>
+        <w:pStyle w:val="Counsel"/>
+      </w:pPr>
+      <w:r>
+        <w:t xml:space="preserve">/s/ Pat Example</w:t>
+      </w:r>
+    </w:p>
+    <w:p>
+      <w:pPr>
+        <w:pStyle w:val="Counsel"/>
       </w:pPr>
       <w:r>
         <w:t xml:space="preserve">PAT EXAMPLE</w:t>
@@ -391,7 +505,7 @@
     </w:p>
     <w:p>
       <w:pPr>
-        <w:pStyle w:val="IndentBlock"/>
+        <w:pStyle w:val="CounselLine"/>
       </w:pPr>
       <w:r>
         <w:rPr>
@@ -403,7 +517,7 @@
     </w:p>
     <w:p>
       <w:pPr>
-        <w:pStyle w:val="IndentBlock"/>
+        <w:pStyle w:val="CounselLine"/>
       </w:pPr>
       <w:r>
         <w:rPr>
@@ -415,7 +529,7 @@
     </w:p>
     <w:p>
       <w:pPr>
-        <w:pStyle w:val="IndentBlock"/>
+        <w:pStyle w:val="CounselLine"/>
       </w:pPr>
       <w:r>
         <w:rPr>
@@ -427,7 +541,7 @@
     </w:p>
     <w:p>
       <w:pPr>
-        <w:pStyle w:val="IndentBlock"/>
+        <w:pStyle w:val="CounselLine"/>
       </w:pPr>
       <w:r>
         <w:rPr>
@@ -439,7 +553,7 @@
     </w:p>
     <w:p>
       <w:pPr>
-        <w:pStyle w:val="IndentBlock"/>
+        <w:pStyle w:val="CounselLine"/>
       </w:pPr>
       <w:r>
         <w:rPr>
@@ -451,6 +565,11 @@
     </w:p>
     <w:p>
       <w:pPr>
+        <w:pStyle w:val="Gap"/>
+      </w:pPr>
+    </w:p>
+    <w:p>
+      <w:pPr>
         <w:pStyle w:val="Single"/>
       </w:pPr>
       <w:r>
@@ -458,13 +577,8 @@
       </w:r>
     </w:p>
     <w:p>
-      <w:r>
-        <w:br w:type="page"/>
-      </w:r>
-    </w:p>
-    <w:p>
-      <w:pPr>
-        <w:pStyle w:val="Heading1"/>
+      <w:pPr>
+        <w:pStyle w:val="Heading1Break"/>
       </w:pPr>
       <w:r>
         <w:t xml:space="preserve">Certificate of Compliance</w:t>
@@ -472,78 +586,101 @@
     </w:p>
     <w:p>
       <w:pPr>
+        <w:pStyle w:val="CertItem"/>
+      </w:pPr>
+      <w:r>
+        <w:t xml:space="preserve">1.</w:t>
+      </w:r>
+      <w:r>
+        <w:tab/>
+      </w:r>
+      <w:r>
+        <w:t xml:space="preserve">This brief complies with the type-volume limitation of Fed. R. Bankr. P. 8015(a)(7)(B) because, excluding the parts of the brief exempted by Fed. R. Bankr. P. 8015(g) and 10th Cir. BAP L.R. 8015-1(d), it contains no more than 6,500 words. The brief contains 129 words, as counted by the drafting software.</w:t>
+      </w:r>
+    </w:p>
+    <w:p>
+      <w:pPr>
+        <w:pStyle w:val="CheckLine"/>
+      </w:pPr>
+      <w:r>
+        <w:rPr>
+          <w:b/>
+          <w:sz w:val="22"/>
+          <w:szCs w:val="22"/>
+          <w:bdr w:val="single" w:sz="6" w:space="0" w:color="000000"/>
+        </w:rPr>
+        <w:t xml:space="preserve">X</w:t>
+      </w:r>
+      <w:r>
+        <w:t xml:space="preserve">  this brief contains 129 words.</w:t>
+      </w:r>
+    </w:p>
+    <w:p>
+      <w:pPr>
+        <w:pStyle w:val="CertItem"/>
+      </w:pPr>
+      <w:r>
+        <w:t xml:space="preserve">2.</w:t>
+      </w:r>
+      <w:r>
+        <w:tab/>
+      </w:r>
+      <w:r>
+        <w:t xml:space="preserve">This brief complies with the typeface requirements of Fed. R. Bankr. P. 8015(a)(5) and 10th Cir. BAP L.R. 8015-1(b) because it has been prepared in a proportionally spaced typeface using Microsoft Word in 14-point Liberation Serif roman type.</w:t>
+      </w:r>
+    </w:p>
+    <w:p>
+      <w:pPr>
+        <w:pStyle w:val="Gap"/>
+      </w:pPr>
+    </w:p>
+    <w:p>
+      <w:pPr>
+        <w:pStyle w:val="Counsel"/>
+      </w:pPr>
+      <w:r>
+        <w:t xml:space="preserve">/s/ Pat Example</w:t>
+      </w:r>
+    </w:p>
+    <w:p>
+      <w:pPr>
+        <w:pStyle w:val="Counsel"/>
+      </w:pPr>
+      <w:r>
+        <w:t xml:space="preserve">Attorney for Appellant Jane Doe</w:t>
+      </w:r>
+    </w:p>
+    <w:p>
+      <w:pPr>
+        <w:pStyle w:val="Counsel"/>
+      </w:pPr>
+      <w:r>
+        <w:t xml:space="preserve">Dated: November 18, 2026</w:t>
+      </w:r>
+    </w:p>
+    <w:p>
+      <w:pPr>
+        <w:pStyle w:val="FrontHeadingBreak"/>
+      </w:pPr>
+      <w:r>
+        <w:t xml:space="preserve">Statement of Related Cases</w:t>
+      </w:r>
+    </w:p>
+    <w:p>
+      <w:pPr>
         <w:pStyle w:val="Single"/>
       </w:pPr>
       <w:r>
-        <w:t xml:space="preserve">1. This brief complies with the type-volume limitation of Fed. R. Bankr. P. 8015(a)(7)(B) because, excluding the parts of the brief exempted by Fed. R. Bankr. P. 8015(g) and 10th Cir. BAP L.R. 8015-1(d), it contains no more than 6,500 words. The brief contains 129 words, as counted by the drafting software.</w:t>
-      </w:r>
-    </w:p>
-    <w:p>
-      <w:pPr>
-        <w:pStyle w:val="IndentBlock"/>
-      </w:pPr>
-      <w:r>
-        <w:t xml:space="preserve">[X] this brief contains 129 words.</w:t>
-      </w:r>
-    </w:p>
-    <w:p>
-      <w:pPr>
-        <w:pStyle w:val="Single"/>
-      </w:pPr>
-      <w:r>
-        <w:t xml:space="preserve">2. This brief complies with the typeface requirements of Fed. R. Bankr. P. 8015(a)(5) and 10th Cir. BAP L.R. 8015-1(b) because it has been prepared in a proportionally spaced typeface using Microsoft Word in 14-point Garamond roman type.</w:t>
-      </w:r>
-    </w:p>
-    <w:p>
-      <w:pPr>
-        <w:pStyle w:val="Signature"/>
-      </w:pPr>
-      <w:r>
-        <w:t xml:space="preserve">/s/  Pat Example</w:t>
-      </w:r>
-    </w:p>
-    <w:p>
-      <w:pPr>
-        <w:pStyle w:val="IndentBlock"/>
-      </w:pPr>
-      <w:r>
-        <w:t xml:space="preserve">Attorney for Appellant Jane Doe</w:t>
-      </w:r>
-    </w:p>
-    <w:p>
-      <w:pPr>
-        <w:pStyle w:val="IndentBlock"/>
-      </w:pPr>
-      <w:r>
-        <w:t xml:space="preserve">Dated: November 18, 2026</w:t>
-      </w:r>
-    </w:p>
-    <w:p>
-      <w:r>
-        <w:br w:type="page"/>
-      </w:r>
-    </w:p>
-    <w:p>
-      <w:pPr>
-        <w:pStyle w:val="FrontHeading"/>
-      </w:pPr>
-      <w:r>
-        <w:t xml:space="preserve">Statement of Related Cases</w:t>
-      </w:r>
-    </w:p>
-    <w:p>
-      <w:pPr>
-        <w:pStyle w:val="Single"/>
-      </w:pPr>
-      <w:r>
         <w:t xml:space="preserve">The filer knows of no related case pending before the United States Supreme Court, any United States Court of Appeals, any United States District Court, or the Bankruptcy Appellate Panel.</w:t>
       </w:r>
     </w:p>
     <w:sectPr>
-      <w:footerReference w:type="default" r:id="rId100"/>
+      <w:footerReference w:type="default" r:id="rIdFtrPage"/>
       <w:footnotePr>
         <w:numFmt w:val="decimal"/>
+        <w:numRestart w:val="continuous"/>
       </w:footnotePr>
+      <w:type w:val="nextPage"/>
       <w:pgSz w:w="12240" w:h="15840"/>
       <w:pgMar w:top="1440" w:right="1440" w:bottom="1440" w:left="1440" w:header="720" w:footer="720" w:gutter="0"/>
       <w:pgNumType w:fmt="decimal" w:start="1"/>
@@ -557,15 +694,35 @@
 <w:comments xmlns:w="http://schemas.openxmlformats.org/wordprocessingml/2006/main" xmlns:m="http://schemas.openxmlformats.org/officeDocument/2006/math" xmlns:r="http://schemas.openxmlformats.org/officeDocument/2006/relationships" xmlns:o="urn:schemas-microsoft-com:office:office" xmlns:v="urn:schemas-microsoft-com:vml" xmlns:w10="urn:schemas-microsoft-com:office:word" xmlns:a="http://schemas.openxmlformats.org/drawingml/2006/main" xmlns:pic="http://schemas.openxmlformats.org/drawingml/2006/picture" xmlns:wp="http://schemas.openxmlformats.org/drawingml/2006/wordprocessingDrawing"/>
 </file>
 
-<file path=word/footer1.xml><?xml version="1.0" encoding="utf-8"?>
+<file path=word/footnotes.xml><?xml version="1.0" encoding="utf-8"?>
+<w:footnotes xmlns:w="http://schemas.openxmlformats.org/wordprocessingml/2006/main" xmlns:m="http://schemas.openxmlformats.org/officeDocument/2006/math" xmlns:r="http://schemas.openxmlformats.org/officeDocument/2006/relationships" xmlns:o="urn:schemas-microsoft-com:office:office" xmlns:v="urn:schemas-microsoft-com:vml" xmlns:w10="urn:schemas-microsoft-com:office:word" xmlns:a="http://schemas.openxmlformats.org/drawingml/2006/main" xmlns:pic="http://schemas.openxmlformats.org/drawingml/2006/picture" xmlns:wp="http://schemas.openxmlformats.org/drawingml/2006/wordprocessingDrawing">
+  <w:footnote w:type="continuationSeparator" w:id="0">
+    <w:p>
+      <w:r>
+        <w:continuationSeparator/>
+      </w:r>
+    </w:p>
+  </w:footnote>
+  <w:footnote w:type="separator" w:id="-1">
+    <w:p>
+      <w:r>
+        <w:separator/>
+      </w:r>
+    </w:p>
+  </w:footnote>
+</w:footnotes>
+</file>
+
+<file path=word/ftr-add.xml><?xml version="1.0" encoding="utf-8"?>
 <w:ftr xmlns:w="http://schemas.openxmlformats.org/wordprocessingml/2006/main" xmlns:r="http://schemas.openxmlformats.org/officeDocument/2006/relationships">
   <w:p>
     <w:pPr>
-      <w:pStyle w:val="Footer"/>
+      <w:spacing w:before="0" w:after="0"/>
       <w:jc w:val="center"/>
-      <w:spacing w:before="0" w:after="0" w:line="240" w:lineRule="auto"/>
-      <w:ind w:firstLine="0"/>
-    </w:pPr>
+    </w:pPr>
+    <w:r>
+      <w:t>Add-</w:t>
+    </w:r>
     <w:r>
       <w:fldChar w:fldCharType="begin"/>
     </w:r>
@@ -585,14 +742,23 @@
 </w:ftr>
 </file>
 
-<file path=word/footer2.xml><?xml version="1.0" encoding="utf-8"?>
+<file path=word/ftr-none.xml><?xml version="1.0" encoding="utf-8"?>
 <w:ftr xmlns:w="http://schemas.openxmlformats.org/wordprocessingml/2006/main" xmlns:r="http://schemas.openxmlformats.org/officeDocument/2006/relationships">
   <w:p>
     <w:pPr>
-      <w:pStyle w:val="Footer"/>
+      <w:spacing w:before="0" w:after="0"/>
       <w:jc w:val="center"/>
-      <w:spacing w:before="0" w:after="0" w:line="240" w:lineRule="auto"/>
-      <w:ind w:firstLine="0"/>
+    </w:pPr>
+  </w:p>
+</w:ftr>
+</file>
+
+<file path=word/ftr-page.xml><?xml version="1.0" encoding="utf-8"?>
+<w:ftr xmlns:w="http://schemas.openxmlformats.org/wordprocessingml/2006/main" xmlns:r="http://schemas.openxmlformats.org/officeDocument/2006/relationships">
+  <w:p>
+    <w:pPr>
+      <w:spacing w:before="0" w:after="0"/>
+      <w:jc w:val="center"/>
     </w:pPr>
     <w:r>
       <w:fldChar w:fldCharType="begin"/>
@@ -613,25 +779,6 @@
 </w:ftr>
 </file>
 
-<file path=word/footnotes.xml><?xml version="1.0" encoding="utf-8"?>
-<w:footnotes xmlns:w="http://schemas.openxmlformats.org/wordprocessingml/2006/main" xmlns:m="http://schemas.openxmlformats.org/officeDocument/2006/math" xmlns:r="http://schemas.openxmlformats.org/officeDocument/2006/relationships" xmlns:o="urn:schemas-microsoft-com:office:office" xmlns:v="urn:schemas-microsoft-com:vml" xmlns:w10="urn:schemas-microsoft-com:office:word" xmlns:a="http://schemas.openxmlformats.org/drawingml/2006/main" xmlns:pic="http://schemas.openxmlformats.org/drawingml/2006/picture" xmlns:wp="http://schemas.openxmlformats.org/drawingml/2006/wordprocessingDrawing">
-  <w:footnote w:type="continuationSeparator" w:id="0">
-    <w:p>
-      <w:r>
-        <w:continuationSeparator/>
-      </w:r>
-    </w:p>
-  </w:footnote>
-  <w:footnote w:type="separator" w:id="-1">
-    <w:p>
-      <w:r>
-        <w:separator/>
-      </w:r>
-    </w:p>
-  </w:footnote>
-</w:footnotes>
-</file>
-
 <file path=word/numbering.xml><?xml version="1.0" encoding="utf-8"?>
 <w:numbering xmlns:w="http://schemas.openxmlformats.org/wordprocessingml/2006/main">
   <w:abstractNum w:abstractNumId="990">
@@ -721,10 +868,10 @@
   <w:docDefaults>
     <w:rPrDefault>
       <w:rPr>
-        <w:rFonts w:ascii="EB Garamond" w:hAnsi="EB Garamond" w:eastAsia="EB Garamond" w:cs="EB Garamond"/>
+        <w:rFonts w:ascii="Liberation Serif" w:hAnsi="Liberation Serif" w:eastAsia="Liberation Serif" w:cs="Liberation Serif"/>
         <w:sz w:val="28"/>
         <w:szCs w:val="28"/>
-        <w:lang w:val="en-US" w:eastAsia="zh-CN" w:bidi="ar-SA"/>
+        <w:lang w:val="en-US" w:eastAsia="en-US" w:bidi="ar-SA"/>
       </w:rPr>
     </w:rPrDefault>
     <w:pPrDefault>
@@ -734,10 +881,11 @@
     </w:pPrDefault>
   </w:docDefaults>
   <w:latentStyles w:defLockedState="0" w:defUIPriority="0" w:defSemiHidden="0" w:defUnhideWhenUsed="0" w:defQFormat="0" w:count="276"/>
-  <w:style w:type="paragraph" w:styleId="Normal">
+  <w:style w:type="paragraph" w:default="1" w:styleId="Normal">
     <w:name w:val="Normal"/>
     <w:qFormat/>
     <w:pPr>
+      <w:widowControl/>
       <w:spacing w:before="0" w:after="0" w:line="240" w:lineRule="auto"/>
       <w:ind w:firstLine="0"/>
     </w:pPr>
@@ -752,22 +900,21 @@
     <w:link w:val="BodyTextChar"/>
     <w:qFormat/>
     <w:pPr>
-      <w:spacing w:before="0" w:after="0" w:line="480" w:lineRule="auto"/>
+      <w:spacing w:before="0" w:after="0" w:line="628" w:lineRule="exact"/>
       <w:ind w:firstLine="720"/>
     </w:pPr>
   </w:style>
-  <w:style w:type="paragraph" w:customStyle="1" w:styleId="FirstParagraph">
+  <w:style w:type="paragraph" w:styleId="FirstParagraph">
     <w:name w:val="First Paragraph"/>
     <w:basedOn w:val="BodyText"/>
     <w:next w:val="BodyText"/>
     <w:qFormat/>
   </w:style>
-  <w:style w:type="paragraph" w:customStyle="1" w:styleId="Compact">
+  <w:style w:type="paragraph" w:styleId="Compact">
     <w:name w:val="Compact"/>
     <w:basedOn w:val="BodyText"/>
     <w:qFormat/>
     <w:pPr>
-      <w:spacing w:before="0" w:after="0" w:line="480" w:lineRule="auto"/>
       <w:ind w:firstLine="0"/>
     </w:pPr>
   </w:style>
@@ -785,7 +932,7 @@
       <w:jc w:val="center"/>
     </w:pPr>
     <w:rPr>
-      <w:rFonts w:ascii="EB Garamond" w:hAnsi="EB Garamond" w:eastAsia="EB Garamond" w:cs="EB Garamond"/>
+      <w:rFonts w:cstheme="majorBidi"/>
       <w:sz w:val="56"/>
       <w:szCs w:val="56"/>
     </w:rPr>
@@ -797,7 +944,7 @@
     <w:uiPriority w:val="10"/>
     <w:rsid w:val="00A10FD9"/>
     <w:rPr>
-      <w:rFonts w:ascii="EB Garamond" w:hAnsi="EB Garamond" w:eastAsia="EB Garamond" w:cs="EB Garamond"/>
+      <w:rFonts w:cstheme="majorBidi"/>
       <w:sz w:val="56"/>
       <w:szCs w:val="56"/>
     </w:rPr>
@@ -816,7 +963,7 @@
       </w:numPr>
     </w:pPr>
     <w:rPr>
-      <w:rFonts w:ascii="EB Garamond" w:hAnsi="EB Garamond" w:eastAsia="EB Garamond" w:cs="EB Garamond"/>
+      <w:rFonts w:cstheme="majorBidi"/>
       <w:spacing w:val="15"/>
       <w:sz w:val="28"/>
       <w:szCs w:val="28"/>
@@ -829,7 +976,7 @@
     <w:uiPriority w:val="11"/>
     <w:rsid w:val="00A10FD9"/>
     <w:rPr>
-      <w:rFonts w:ascii="EB Garamond" w:hAnsi="EB Garamond" w:eastAsia="EB Garamond" w:cs="EB Garamond"/>
+      <w:rFonts w:cstheme="majorBidi"/>
       <w:color w:val="595959" w:themeColor="text1" w:themeTint="A6"/>
       <w:spacing w:val="15"/>
       <w:sz w:val="28"/>
@@ -913,7 +1060,7 @@
     <w:pPr>
       <w:keepNext/>
       <w:keepLines/>
-      <w:spacing w:before="360" w:after="240" w:line="240" w:lineRule="auto"/>
+      <w:spacing w:before="480" w:after="360" w:line="240" w:lineRule="auto"/>
       <w:ind w:firstLine="0"/>
       <w:jc w:val="center"/>
       <w:outlineLvl w:val="0"/>
@@ -922,8 +1069,9 @@
       <w:b/>
       <w:bCs/>
       <w:caps/>
-      <w:sz w:val="28"/>
-      <w:szCs w:val="28"/>
+      <w:color w:val="000000"/>
+      <w:sz w:val="32"/>
+      <w:szCs w:val="32"/>
     </w:rPr>
   </w:style>
   <w:style w:type="paragraph" w:styleId="Heading2">
@@ -936,83 +1084,50 @@
     <w:pPr>
       <w:keepNext/>
       <w:keepLines/>
-      <w:spacing w:before="240" w:after="240" w:line="240" w:lineRule="auto"/>
-      <w:ind w:left="720" w:hanging="720"/>
+      <w:spacing w:before="340" w:after="260" w:line="240" w:lineRule="auto"/>
+      <w:ind w:firstLine="0"/>
       <w:outlineLvl w:val="1"/>
     </w:pPr>
     <w:rPr>
       <w:b/>
       <w:bCs/>
+      <w:color w:val="000000"/>
       <w:sz w:val="28"/>
       <w:szCs w:val="28"/>
     </w:rPr>
   </w:style>
   <w:style w:type="paragraph" w:styleId="Heading3">
     <w:name w:val="heading 3"/>
-    <w:basedOn w:val="Normal"/>
+    <w:basedOn w:val="Heading2"/>
     <w:next w:val="BodyText"/>
     <w:uiPriority w:val="9"/>
     <w:unhideWhenUsed/>
     <w:qFormat/>
     <w:pPr>
-      <w:keepNext/>
-      <w:keepLines/>
-      <w:spacing w:before="240" w:after="240" w:line="240" w:lineRule="auto"/>
-      <w:ind w:left="1440" w:hanging="720"/>
       <w:outlineLvl w:val="2"/>
     </w:pPr>
-    <w:rPr>
-      <w:b/>
-      <w:bCs/>
-      <w:sz w:val="28"/>
-      <w:szCs w:val="28"/>
-    </w:rPr>
   </w:style>
   <w:style w:type="paragraph" w:styleId="Heading4">
     <w:name w:val="heading 4"/>
-    <w:basedOn w:val="Normal"/>
+    <w:basedOn w:val="Heading2"/>
     <w:next w:val="BodyText"/>
     <w:uiPriority w:val="9"/>
     <w:unhideWhenUsed/>
     <w:qFormat/>
     <w:pPr>
-      <w:keepNext/>
-      <w:keepLines/>
-      <w:spacing w:before="240" w:after="240" w:line="240" w:lineRule="auto"/>
-      <w:ind w:left="2160" w:hanging="720"/>
       <w:outlineLvl w:val="3"/>
     </w:pPr>
-    <w:rPr>
-      <w:b/>
-      <w:bCs/>
-      <w:i/>
-      <w:iCs/>
-      <w:sz w:val="28"/>
-      <w:szCs w:val="28"/>
-    </w:rPr>
   </w:style>
   <w:style w:type="paragraph" w:styleId="Heading5">
     <w:name w:val="heading 5"/>
-    <w:basedOn w:val="Normal"/>
+    <w:basedOn w:val="Heading2"/>
     <w:next w:val="BodyText"/>
     <w:uiPriority w:val="9"/>
     <w:unhideWhenUsed/>
     <w:qFormat/>
     <w:pPr>
-      <w:keepNext/>
-      <w:keepLines/>
-      <w:spacing w:before="240" w:after="240" w:line="240" w:lineRule="auto"/>
-      <w:ind w:left="2880" w:hanging="720"/>
       <w:outlineLvl w:val="4"/>
     </w:pPr>
-    <w:rPr>
-      <w:b/>
-      <w:bCs/>
-      <w:i/>
-      <w:iCs/>
-      <w:sz w:val="28"/>
-      <w:szCs w:val="28"/>
-    </w:rPr>
   </w:style>
   <w:style w:type="paragraph" w:styleId="Heading6">
     <w:name w:val="heading 6"/>
@@ -1031,7 +1146,7 @@
       <w:outlineLvl w:val="5"/>
     </w:pPr>
     <w:rPr>
-      <w:rFonts w:ascii="EB Garamond" w:hAnsi="EB Garamond" w:eastAsia="EB Garamond" w:cs="EB Garamond"/>
+      <w:rFonts w:cstheme="majorBidi"/>
       <w:i/>
       <w:iCs/>
       <w:color w:val="595959" w:themeColor="text1" w:themeTint="A6"/>
@@ -1054,7 +1169,7 @@
       <w:outlineLvl w:val="6"/>
     </w:pPr>
     <w:rPr>
-      <w:rFonts w:ascii="EB Garamond" w:hAnsi="EB Garamond" w:eastAsia="EB Garamond" w:cs="EB Garamond"/>
+      <w:rFonts w:cstheme="majorBidi"/>
       <w:color w:val="595959" w:themeColor="text1" w:themeTint="A6"/>
     </w:rPr>
   </w:style>
@@ -1075,7 +1190,7 @@
       <w:outlineLvl w:val="7"/>
     </w:pPr>
     <w:rPr>
-      <w:rFonts w:ascii="EB Garamond" w:hAnsi="EB Garamond" w:eastAsia="EB Garamond" w:cs="EB Garamond"/>
+      <w:rFonts w:cstheme="majorBidi"/>
       <w:i/>
       <w:iCs/>
       <w:color w:val="272727" w:themeColor="text1" w:themeTint="D8"/>
@@ -1098,7 +1213,7 @@
       <w:outlineLvl w:val="8"/>
     </w:pPr>
     <w:rPr>
-      <w:rFonts w:ascii="EB Garamond" w:hAnsi="EB Garamond" w:eastAsia="EB Garamond" w:cs="EB Garamond"/>
+      <w:rFonts w:cstheme="majorBidi"/>
       <w:color w:val="272727" w:themeColor="text1" w:themeTint="D8"/>
     </w:rPr>
   </w:style>
@@ -1109,7 +1224,7 @@
     <w:uiPriority w:val="9"/>
     <w:rsid w:val="00A10FD9"/>
     <w:rPr>
-      <w:rFonts w:ascii="EB Garamond" w:hAnsi="EB Garamond" w:eastAsia="EB Garamond" w:cs="EB Garamond"/>
+      <w:rFonts w:cstheme="majorBidi"/>
       <w:color w:val="0F4761" w:themeColor="accent1" w:themeShade="BF"/>
       <w:sz w:val="40"/>
       <w:szCs w:val="40"/>
@@ -1123,7 +1238,7 @@
     <w:semiHidden/>
     <w:rsid w:val="00A10FD9"/>
     <w:rPr>
-      <w:rFonts w:ascii="EB Garamond" w:hAnsi="EB Garamond" w:eastAsia="EB Garamond" w:cs="EB Garamond"/>
+      <w:rFonts w:cstheme="majorBidi"/>
       <w:color w:val="0F4761" w:themeColor="accent1" w:themeShade="BF"/>
       <w:sz w:val="32"/>
       <w:szCs w:val="32"/>
@@ -1137,7 +1252,7 @@
     <w:semiHidden/>
     <w:rsid w:val="00A10FD9"/>
     <w:rPr>
-      <w:rFonts w:ascii="EB Garamond" w:hAnsi="EB Garamond" w:eastAsia="EB Garamond" w:cs="EB Garamond"/>
+      <w:rFonts w:cstheme="majorBidi"/>
       <w:color w:val="0F4761" w:themeColor="accent1" w:themeShade="BF"/>
       <w:sz w:val="28"/>
       <w:szCs w:val="28"/>
@@ -1151,7 +1266,7 @@
     <w:semiHidden/>
     <w:rsid w:val="00A10FD9"/>
     <w:rPr>
-      <w:rFonts w:ascii="EB Garamond" w:hAnsi="EB Garamond" w:eastAsia="EB Garamond" w:cs="EB Garamond"/>
+      <w:rFonts w:cstheme="majorBidi"/>
       <w:i/>
       <w:iCs/>
       <w:color w:val="0F4761" w:themeColor="accent1" w:themeShade="BF"/>
@@ -1165,7 +1280,7 @@
     <w:semiHidden/>
     <w:rsid w:val="00A10FD9"/>
     <w:rPr>
-      <w:rFonts w:ascii="EB Garamond" w:hAnsi="EB Garamond" w:eastAsia="EB Garamond" w:cs="EB Garamond"/>
+      <w:rFonts w:cstheme="majorBidi"/>
       <w:color w:val="0F4761" w:themeColor="accent1" w:themeShade="BF"/>
     </w:rPr>
   </w:style>
@@ -1177,7 +1292,7 @@
     <w:semiHidden/>
     <w:rsid w:val="00A10FD9"/>
     <w:rPr>
-      <w:rFonts w:ascii="EB Garamond" w:hAnsi="EB Garamond" w:eastAsia="EB Garamond" w:cs="EB Garamond"/>
+      <w:rFonts w:cstheme="majorBidi"/>
       <w:i/>
       <w:iCs/>
       <w:color w:val="595959" w:themeColor="text1" w:themeTint="A6"/>
@@ -1191,7 +1306,7 @@
     <w:semiHidden/>
     <w:rsid w:val="00A10FD9"/>
     <w:rPr>
-      <w:rFonts w:ascii="EB Garamond" w:hAnsi="EB Garamond" w:eastAsia="EB Garamond" w:cs="EB Garamond"/>
+      <w:rFonts w:cstheme="majorBidi"/>
       <w:color w:val="595959" w:themeColor="text1" w:themeTint="A6"/>
     </w:rPr>
   </w:style>
@@ -1203,7 +1318,7 @@
     <w:semiHidden/>
     <w:rsid w:val="00A10FD9"/>
     <w:rPr>
-      <w:rFonts w:ascii="EB Garamond" w:hAnsi="EB Garamond" w:eastAsia="EB Garamond" w:cs="EB Garamond"/>
+      <w:rFonts w:cstheme="majorBidi"/>
       <w:i/>
       <w:iCs/>
       <w:color w:val="272727" w:themeColor="text1" w:themeTint="D8"/>
@@ -1217,7 +1332,7 @@
     <w:semiHidden/>
     <w:rsid w:val="00A10FD9"/>
     <w:rPr>
-      <w:rFonts w:ascii="EB Garamond" w:hAnsi="EB Garamond" w:eastAsia="EB Garamond" w:cs="EB Garamond"/>
+      <w:rFonts w:cstheme="majorBidi"/>
       <w:color w:val="272727" w:themeColor="text1" w:themeTint="D8"/>
     </w:rPr>
   </w:style>
@@ -1228,7 +1343,8 @@
     <w:uiPriority w:val="9"/>
     <w:qFormat/>
     <w:pPr>
-      <w:spacing w:before="0" w:after="240" w:line="240" w:lineRule="auto"/>
+      <w:pBdr/>
+      <w:spacing w:before="280" w:after="280" w:line="240" w:lineRule="auto"/>
       <w:ind w:left="720" w:right="720" w:firstLine="0"/>
     </w:pPr>
   </w:style>
@@ -1239,7 +1355,7 @@
     <w:uiPriority w:val="99"/>
     <w:unhideWhenUsed/>
     <w:pPr>
-      <w:spacing w:before="0" w:after="100" w:line="240" w:lineRule="auto"/>
+      <w:spacing w:before="0" w:after="140" w:line="240" w:lineRule="auto"/>
       <w:ind w:firstLine="0"/>
     </w:pPr>
     <w:rPr>
@@ -1362,9 +1478,9 @@
   </w:style>
   <w:style w:type="character" w:styleId="Hyperlink">
     <w:name w:val="Hyperlink"/>
-    <w:basedOn w:val="BodyTextChar"/>
-    <w:rPr>
-      <w:color w:val="4F81BD" w:themeColor="accent1"/>
+    <w:basedOn w:val="DefaultParagraphFont"/>
+    <w:rPr>
+      <w:color w:val="000000"/>
     </w:rPr>
   </w:style>
   <w:style w:type="paragraph" w:styleId="TOCHeading">
@@ -1379,70 +1495,28 @@
       <w:outlineLvl w:val="9"/>
     </w:pPr>
     <w:rPr>
-      <w:rFonts w:ascii="EB Garamond" w:hAnsi="EB Garamond" w:eastAsia="EB Garamond" w:cs="EB Garamond"/>
+      <w:rFonts w:cstheme="majorBidi"/>
       <w:b w:val="0"/>
       <w:bCs w:val="0"/>
       <w:color w:val="365F91" w:themeColor="accent1" w:themeShade="BF"/>
     </w:rPr>
   </w:style>
-  <w:style w:type="paragraph" w:customStyle="1" w:styleId="Centered">
-    <w:name w:val="Centered"/>
-    <w:basedOn w:val="Normal"/>
-    <w:qFormat/>
-    <w:pPr>
-      <w:spacing w:before="0" w:after="120" w:line="240" w:lineRule="auto"/>
-      <w:ind w:firstLine="0"/>
-      <w:jc w:val="center"/>
-    </w:pPr>
-  </w:style>
-  <w:style w:type="paragraph" w:customStyle="1" w:styleId="Single">
-    <w:name w:val="Single"/>
-    <w:basedOn w:val="Normal"/>
-    <w:qFormat/>
-    <w:pPr>
-      <w:spacing w:before="0" w:after="240" w:line="240" w:lineRule="auto"/>
-      <w:ind w:firstLine="0"/>
-    </w:pPr>
-  </w:style>
-  <w:style w:type="paragraph" w:customStyle="1" w:styleId="Signature">
-    <w:name w:val="Signature"/>
-    <w:basedOn w:val="Normal"/>
+  <w:style w:type="paragraph" w:customStyle="1" w:styleId="BodyKeep">
+    <w:name w:val="Body Keep"/>
+    <w:basedOn w:val="BodyText"/>
     <w:qFormat/>
     <w:pPr>
       <w:keepNext/>
-      <w:spacing w:before="240" w:after="0" w:line="240" w:lineRule="auto"/>
-      <w:ind w:left="4320" w:firstLine="0"/>
-    </w:pPr>
-  </w:style>
-  <w:style w:type="paragraph" w:customStyle="1" w:styleId="Right">
-    <w:name w:val="Right"/>
-    <w:basedOn w:val="Normal"/>
-    <w:qFormat/>
-    <w:pPr>
-      <w:spacing w:before="0" w:after="120" w:line="240" w:lineRule="auto"/>
-      <w:ind w:firstLine="0"/>
-      <w:jc w:val="right"/>
-    </w:pPr>
-  </w:style>
-  <w:style w:type="paragraph" w:customStyle="1" w:styleId="IndentBlock">
-    <w:name w:val="Indent Block"/>
-    <w:basedOn w:val="Normal"/>
-    <w:qFormat/>
-    <w:pPr>
-      <w:spacing w:before="0" w:after="0" w:line="240" w:lineRule="auto"/>
-      <w:ind w:left="4320" w:firstLine="0"/>
-    </w:pPr>
-  </w:style>
-  <w:style w:type="paragraph" w:customStyle="1" w:styleId="Rule">
-    <w:name w:val="Rule"/>
-    <w:basedOn w:val="Normal"/>
-    <w:qFormat/>
-    <w:pPr>
-      <w:pBdr>
-        <w:bottom w:val="double" w:sz="6" w:space="1" w:color="000000"/>
-      </w:pBdr>
-      <w:spacing w:before="0" w:after="240" w:line="240" w:lineRule="auto"/>
-      <w:ind w:firstLine="0"/>
+      <w:keepLines/>
+    </w:pPr>
+  </w:style>
+  <w:style w:type="paragraph" w:customStyle="1" w:styleId="Heading1Break">
+    <w:name w:val="Heading 1 Break"/>
+    <w:basedOn w:val="Heading1"/>
+    <w:next w:val="BodyText"/>
+    <w:qFormat/>
+    <w:pPr>
+      <w:pageBreakBefore/>
     </w:pPr>
   </w:style>
   <w:style w:type="paragraph" w:customStyle="1" w:styleId="FrontHeading">
@@ -1453,7 +1527,7 @@
     <w:pPr>
       <w:keepNext/>
       <w:keepLines/>
-      <w:spacing w:before="360" w:after="240" w:line="240" w:lineRule="auto"/>
+      <w:spacing w:before="480" w:after="360" w:line="240" w:lineRule="auto"/>
       <w:ind w:firstLine="0"/>
       <w:jc w:val="center"/>
     </w:pPr>
@@ -1461,97 +1535,342 @@
       <w:b/>
       <w:bCs/>
       <w:caps/>
-      <w:sz w:val="28"/>
-      <w:szCs w:val="28"/>
-    </w:rPr>
+      <w:sz w:val="32"/>
+      <w:szCs w:val="32"/>
+    </w:rPr>
+  </w:style>
+  <w:style w:type="paragraph" w:customStyle="1" w:styleId="FrontHeadingBreak">
+    <w:name w:val="Front Heading Break"/>
+    <w:basedOn w:val="FrontHeading"/>
+    <w:next w:val="Single"/>
+    <w:qFormat/>
+    <w:pPr>
+      <w:pageBreakBefore/>
+    </w:pPr>
   </w:style>
   <w:style w:type="paragraph" w:customStyle="1" w:styleId="PointHeading">
     <w:name w:val="Point Heading"/>
-    <w:basedOn w:val="Normal"/>
+    <w:basedOn w:val="Heading2"/>
     <w:next w:val="BodyText"/>
+    <w:qFormat/>
+    <w:pPr>
+      <w:spacing w:before="340" w:after="280" w:line="240" w:lineRule="auto"/>
+      <w:jc w:val="center"/>
+    </w:pPr>
+  </w:style>
+  <w:style w:type="paragraph" w:customStyle="1" w:styleId="SubHead1">
+    <w:name w:val="Sub Head 1"/>
+    <w:basedOn w:val="Heading2"/>
+    <w:next w:val="BodyText"/>
+    <w:qFormat/>
+    <w:pPr>
+      <w:tabs>
+        <w:tab w:val="left" w:pos="1440"/>
+      </w:tabs>
+      <w:ind w:left="1440" w:hanging="720"/>
+    </w:pPr>
+  </w:style>
+  <w:style w:type="paragraph" w:customStyle="1" w:styleId="SubHead2">
+    <w:name w:val="Sub Head 2"/>
+    <w:basedOn w:val="Heading3"/>
+    <w:next w:val="BodyText"/>
+    <w:qFormat/>
+    <w:pPr>
+      <w:tabs>
+        <w:tab w:val="left" w:pos="2160"/>
+      </w:tabs>
+      <w:ind w:left="2160" w:hanging="720"/>
+    </w:pPr>
+  </w:style>
+  <w:style w:type="paragraph" w:customStyle="1" w:styleId="SubHead3">
+    <w:name w:val="Sub Head 3"/>
+    <w:basedOn w:val="Heading4"/>
+    <w:next w:val="BodyText"/>
+    <w:qFormat/>
+    <w:pPr>
+      <w:tabs>
+        <w:tab w:val="left" w:pos="2880"/>
+      </w:tabs>
+      <w:ind w:left="2880" w:hanging="720"/>
+    </w:pPr>
+  </w:style>
+  <w:style w:type="paragraph" w:customStyle="1" w:styleId="SubHead4">
+    <w:name w:val="Sub Head 4"/>
+    <w:basedOn w:val="Heading5"/>
+    <w:next w:val="BodyText"/>
+    <w:qFormat/>
+    <w:pPr>
+      <w:tabs>
+        <w:tab w:val="left" w:pos="3600"/>
+      </w:tabs>
+      <w:ind w:left="3600" w:hanging="720"/>
+    </w:pPr>
+  </w:style>
+  <w:style w:type="paragraph" w:styleId="Footer">
+    <w:name w:val="footer"/>
+    <w:basedOn w:val="Normal"/>
+    <w:uiPriority w:val="99"/>
+    <w:unhideWhenUsed/>
+    <w:pPr>
+      <w:spacing w:after="0" w:line="240" w:lineRule="auto"/>
+      <w:ind w:firstLine="0"/>
+      <w:jc w:val="center"/>
+    </w:pPr>
+  </w:style>
+  <w:style w:type="paragraph" w:customStyle="1" w:styleId="SectionBreak">
+    <w:name w:val="Section Break"/>
+    <w:basedOn w:val="Normal"/>
+    <w:pPr>
+      <w:spacing w:before="0" w:after="0" w:line="20" w:lineRule="exact"/>
+      <w:ind w:firstLine="0"/>
+    </w:pPr>
+    <w:rPr>
+      <w:sz w:val="2"/>
+      <w:szCs w:val="2"/>
+    </w:rPr>
+  </w:style>
+  <w:style w:type="paragraph" w:customStyle="1" w:styleId="Centered">
+    <w:name w:val="Centered"/>
+    <w:basedOn w:val="Normal"/>
+    <w:qFormat/>
+    <w:pPr>
+      <w:spacing w:before="0" w:after="70" w:line="240" w:lineRule="auto"/>
+      <w:ind w:firstLine="0"/>
+      <w:jc w:val="center"/>
+    </w:pPr>
+  </w:style>
+  <w:style w:type="paragraph" w:customStyle="1" w:styleId="Single">
+    <w:name w:val="Single"/>
+    <w:basedOn w:val="Normal"/>
+    <w:qFormat/>
+    <w:pPr>
+      <w:spacing w:before="0" w:after="280" w:line="240" w:lineRule="auto"/>
+      <w:ind w:firstLine="0"/>
+    </w:pPr>
+  </w:style>
+  <w:style w:type="paragraph" w:customStyle="1" w:styleId="CertItem">
+    <w:name w:val="Cert Item"/>
+    <w:basedOn w:val="Single"/>
+    <w:qFormat/>
+    <w:pPr>
+      <w:tabs>
+        <w:tab w:val="left" w:pos="360"/>
+      </w:tabs>
+      <w:ind w:left="360" w:hanging="360"/>
+    </w:pPr>
+  </w:style>
+  <w:style w:type="paragraph" w:customStyle="1" w:styleId="CheckLine">
+    <w:name w:val="Check Line"/>
+    <w:basedOn w:val="Single"/>
+    <w:qFormat/>
+    <w:pPr>
+      <w:keepLines/>
+      <w:spacing w:before="0" w:after="220" w:line="240" w:lineRule="auto"/>
+      <w:ind w:left="448" w:firstLine="0"/>
+    </w:pPr>
+  </w:style>
+  <w:style w:type="paragraph" w:customStyle="1" w:styleId="Right">
+    <w:name w:val="Right"/>
+    <w:basedOn w:val="Normal"/>
+    <w:qFormat/>
+    <w:pPr>
+      <w:spacing w:before="0" w:after="70" w:line="240" w:lineRule="auto"/>
+      <w:ind w:firstLine="0"/>
+      <w:jc w:val="right"/>
+    </w:pPr>
+  </w:style>
+  <w:style w:type="paragraph" w:customStyle="1" w:styleId="RightHead">
+    <w:name w:val="Right Head"/>
+    <w:basedOn w:val="Normal"/>
+    <w:pPr>
+      <w:keepNext/>
+      <w:spacing w:before="0" w:after="0" w:line="240" w:lineRule="auto"/>
+      <w:ind w:firstLine="0"/>
+      <w:jc w:val="right"/>
+    </w:pPr>
+    <w:rPr>
+      <w:b/>
+      <w:u w:val="single"/>
+    </w:rPr>
+  </w:style>
+  <w:style w:type="paragraph" w:customStyle="1" w:styleId="Designation">
+    <w:name w:val="Designation"/>
+    <w:basedOn w:val="Normal"/>
+    <w:qFormat/>
+    <w:pPr>
+      <w:spacing w:before="0" w:after="70" w:line="240" w:lineRule="auto"/>
+      <w:ind w:left="4680" w:firstLine="0"/>
+    </w:pPr>
+  </w:style>
+  <w:style w:type="paragraph" w:customStyle="1" w:styleId="Counsel">
+    <w:name w:val="Counsel"/>
+    <w:basedOn w:val="Normal"/>
     <w:qFormat/>
     <w:pPr>
       <w:keepNext/>
       <w:keepLines/>
-      <w:spacing w:before="240" w:after="240" w:line="240" w:lineRule="auto"/>
+      <w:spacing w:before="0" w:after="0" w:line="240" w:lineRule="auto"/>
+      <w:ind w:left="4680" w:firstLine="0"/>
+    </w:pPr>
+  </w:style>
+  <w:style w:type="paragraph" w:customStyle="1" w:styleId="CounselLine">
+    <w:name w:val="Counsel Line"/>
+    <w:basedOn w:val="Counsel"/>
+    <w:qFormat/>
+    <w:pPr>
+      <w:ind w:left="4820" w:firstLine="0"/>
+    </w:pPr>
+  </w:style>
+  <w:style w:type="paragraph" w:customStyle="1" w:styleId="Gap">
+    <w:name w:val="Gap"/>
+    <w:basedOn w:val="Normal"/>
+    <w:pPr>
+      <w:keepNext/>
+      <w:spacing w:before="0" w:after="0" w:line="320" w:lineRule="exact"/>
       <w:ind w:firstLine="0"/>
-      <w:jc w:val="center"/>
-      <w:outlineLvl w:val="1"/>
+    </w:pPr>
+  </w:style>
+  <w:style w:type="paragraph" w:customStyle="1" w:styleId="RuleDouble">
+    <w:name w:val="Rule Double"/>
+    <w:basedOn w:val="Centered"/>
+    <w:pPr>
+      <w:pBdr>
+        <w:top w:val="single" w:sz="13" w:space="0" w:color="000000"/>
+        <w:bottom w:val="single" w:sz="4" w:space="0" w:color="000000"/>
+      </w:pBdr>
+      <w:spacing w:before="260" w:after="260" w:line="50" w:lineRule="exact"/>
+    </w:pPr>
+    <w:rPr>
+      <w:sz w:val="4"/>
+      <w:szCs w:val="4"/>
+    </w:rPr>
+  </w:style>
+  <w:style w:type="paragraph" w:customStyle="1" w:styleId="RuleShort">
+    <w:name w:val="Rule Short"/>
+    <w:basedOn w:val="Centered"/>
+    <w:pPr>
+      <w:pBdr>
+        <w:bottom w:val="single" w:sz="6" w:space="1" w:color="000000"/>
+      </w:pBdr>
+      <w:spacing w:before="200" w:after="320" w:line="120" w:lineRule="exact"/>
+      <w:ind w:left="3240" w:right="3240" w:firstLine="0"/>
+    </w:pPr>
+    <w:rPr>
+      <w:sz w:val="4"/>
+      <w:szCs w:val="4"/>
+    </w:rPr>
+  </w:style>
+  <w:style w:type="paragraph" w:customStyle="1" w:styleId="TOCK0">
+    <w:name w:val="TOC Entry 0"/>
+    <w:basedOn w:val="Normal"/>
+    <w:qFormat/>
+    <w:pPr>
+      <w:tabs>
+        <w:tab w:val="left" w:pos="720"/>
+        <w:tab w:val="right" w:leader="dot" w:pos="9340"/>
+      </w:tabs>
+      <w:spacing w:before="120" w:after="0" w:line="240" w:lineRule="auto"/>
+      <w:ind w:left="720" w:right="720" w:hanging="720"/>
+    </w:pPr>
+  </w:style>
+  <w:style w:type="paragraph" w:customStyle="1" w:styleId="TOCK1">
+    <w:name w:val="TOC Entry 1"/>
+    <w:basedOn w:val="TOCK0"/>
+    <w:qFormat/>
+    <w:pPr>
+      <w:tabs>
+        <w:tab w:val="left" w:pos="1440"/>
+      </w:tabs>
+      <w:spacing w:before="70"/>
+      <w:ind w:left="1440" w:right="720" w:hanging="720"/>
+    </w:pPr>
+  </w:style>
+  <w:style w:type="paragraph" w:customStyle="1" w:styleId="TOCK2">
+    <w:name w:val="TOC Entry 2"/>
+    <w:basedOn w:val="TOCK0"/>
+    <w:qFormat/>
+    <w:pPr>
+      <w:tabs>
+        <w:tab w:val="left" w:pos="2160"/>
+      </w:tabs>
+      <w:spacing w:before="70"/>
+      <w:ind w:left="2160" w:right="720" w:hanging="720"/>
+    </w:pPr>
+  </w:style>
+  <w:style w:type="paragraph" w:customStyle="1" w:styleId="TOCK3">
+    <w:name w:val="TOC Entry 3"/>
+    <w:basedOn w:val="TOCK0"/>
+    <w:qFormat/>
+    <w:pPr>
+      <w:tabs>
+        <w:tab w:val="left" w:pos="2880"/>
+      </w:tabs>
+      <w:spacing w:before="70"/>
+      <w:ind w:left="2880" w:right="720" w:hanging="720"/>
+    </w:pPr>
+  </w:style>
+  <w:style w:type="paragraph" w:customStyle="1" w:styleId="TOAGroup">
+    <w:name w:val="TOA Group"/>
+    <w:basedOn w:val="Normal"/>
+    <w:qFormat/>
+    <w:pPr>
+      <w:keepNext/>
+      <w:tabs>
+        <w:tab w:val="right" w:pos="9360"/>
+      </w:tabs>
+      <w:spacing w:before="280" w:after="0" w:line="240" w:lineRule="auto"/>
+      <w:ind w:firstLine="0"/>
     </w:pPr>
     <w:rPr>
       <w:b/>
       <w:bCs/>
-      <w:smallCaps/>
-      <w:sz w:val="28"/>
-      <w:szCs w:val="28"/>
-    </w:rPr>
-  </w:style>
-  <w:style w:type="paragraph" w:customStyle="1" w:styleId="TOCLine1">
-    <w:name w:val="TOC Line 1"/>
-    <w:basedOn w:val="Normal"/>
-    <w:qFormat/>
-    <w:pPr>
-      <w:spacing w:before="120" w:after="60" w:line="240" w:lineRule="auto"/>
-      <w:ind w:left="0" w:firstLine="0"/>
-    </w:pPr>
-  </w:style>
-  <w:style w:type="paragraph" w:customStyle="1" w:styleId="TOCLine2">
-    <w:name w:val="TOC Line 2"/>
-    <w:basedOn w:val="Normal"/>
-    <w:qFormat/>
-    <w:pPr>
-      <w:spacing w:before="0" w:after="60" w:line="240" w:lineRule="auto"/>
-      <w:ind w:left="720" w:hanging="720" w:firstLine="0"/>
-    </w:pPr>
-  </w:style>
-  <w:style w:type="paragraph" w:customStyle="1" w:styleId="TOCLine3">
-    <w:name w:val="TOC Line 3"/>
-    <w:basedOn w:val="Normal"/>
-    <w:qFormat/>
-    <w:pPr>
-      <w:spacing w:before="0" w:after="60" w:line="240" w:lineRule="auto"/>
-      <w:ind w:left="1440" w:hanging="720" w:firstLine="0"/>
-    </w:pPr>
-  </w:style>
-  <w:style w:type="paragraph" w:customStyle="1" w:styleId="TOCLine4">
-    <w:name w:val="TOC Line 4"/>
-    <w:basedOn w:val="Normal"/>
-    <w:qFormat/>
-    <w:pPr>
-      <w:spacing w:before="0" w:after="60" w:line="240" w:lineRule="auto"/>
-      <w:ind w:left="2160" w:hanging="720" w:firstLine="0"/>
-    </w:pPr>
-  </w:style>
-  <w:style w:type="paragraph" w:customStyle="1" w:styleId="TOAGroup">
-    <w:name w:val="TOA Group"/>
-    <w:basedOn w:val="Normal"/>
-    <w:qFormat/>
-    <w:pPr>
-      <w:keepNext/>
-      <w:spacing w:before="240" w:after="120" w:line="240" w:lineRule="auto"/>
-      <w:ind w:firstLine="0"/>
-    </w:pPr>
-    <w:rPr>
-      <w:b/>
-      <w:bCs/>
-    </w:rPr>
-  </w:style>
-  <w:style w:type="paragraph" w:customStyle="1" w:styleId="TOAEntry">
-    <w:name w:val="TOA Entry"/>
-    <w:basedOn w:val="Normal"/>
-    <w:qFormat/>
-    <w:pPr>
-      <w:spacing w:before="0" w:after="200" w:line="240" w:lineRule="auto"/>
-      <w:ind w:left="504" w:hanging="504" w:firstLine="0"/>
-    </w:pPr>
+    </w:rPr>
+  </w:style>
+  <w:style w:type="paragraph" w:customStyle="1" w:styleId="TOALine">
+    <w:name w:val="TOA Line"/>
+    <w:basedOn w:val="Normal"/>
+    <w:qFormat/>
+    <w:pPr>
+      <w:keepLines/>
+      <w:tabs>
+        <w:tab w:val="right" w:leader="dot" w:pos="9340"/>
+      </w:tabs>
+      <w:spacing w:before="140" w:after="0" w:line="240" w:lineRule="auto"/>
+      <w:ind w:left="504" w:right="1120" w:hanging="504"/>
+    </w:pPr>
+  </w:style>
+  <w:style w:type="paragraph" w:customStyle="1" w:styleId="BodyKeep">
+    <w:name w:val="BodyKeep"/>
+    <w:basedOn w:val="BodyText"/>
+    <w:qFormat/>
+  </w:style>
+  <w:style w:type="paragraph" w:customStyle="1" w:styleId="CertItem">
+    <w:name w:val="CertItem"/>
+    <w:basedOn w:val="BodyText"/>
+    <w:qFormat/>
+  </w:style>
+  <w:style w:type="paragraph" w:customStyle="1" w:styleId="CheckLine">
+    <w:name w:val="CheckLine"/>
+    <w:basedOn w:val="BodyText"/>
+    <w:qFormat/>
+  </w:style>
+  <w:style w:type="paragraph" w:customStyle="1" w:styleId="CounselLine">
+    <w:name w:val="CounselLine"/>
+    <w:basedOn w:val="BodyText"/>
+    <w:qFormat/>
   </w:style>
   <w:style w:type="paragraph" w:customStyle="1" w:styleId="FrontHeading">
     <w:name w:val="FrontHeading"/>
     <w:basedOn w:val="BodyText"/>
     <w:qFormat/>
   </w:style>
-  <w:style w:type="paragraph" w:customStyle="1" w:styleId="IndentBlock">
-    <w:name w:val="IndentBlock"/>
+  <w:style w:type="paragraph" w:customStyle="1" w:styleId="FrontHeadingBreak">
+    <w:name w:val="FrontHeadingBreak"/>
+    <w:basedOn w:val="BodyText"/>
+    <w:qFormat/>
+  </w:style>
+  <w:style w:type="paragraph" w:customStyle="1" w:styleId="Heading1Break">
+    <w:name w:val="Heading1Break"/>
     <w:basedOn w:val="BodyText"/>
     <w:qFormat/>
   </w:style>
@@ -1560,8 +1879,8 @@
     <w:basedOn w:val="BodyText"/>
     <w:qFormat/>
   </w:style>
-  <w:style w:type="paragraph" w:customStyle="1" w:styleId="TOAEntry">
-    <w:name w:val="TOAEntry"/>
+  <w:style w:type="paragraph" w:customStyle="1" w:styleId="RightHead">
+    <w:name w:val="RightHead"/>
     <w:basedOn w:val="BodyText"/>
     <w:qFormat/>
   </w:style>
@@ -1570,13 +1889,13 @@
     <w:basedOn w:val="BodyText"/>
     <w:qFormat/>
   </w:style>
-  <w:style w:type="paragraph" w:customStyle="1" w:styleId="TOCLine1">
-    <w:name w:val="TOCLine1"/>
+  <w:style w:type="paragraph" w:customStyle="1" w:styleId="TOALine">
+    <w:name w:val="TOALine"/>
     <w:basedOn w:val="BodyText"/>
     <w:qFormat/>
   </w:style>
-  <w:style w:type="paragraph" w:customStyle="1" w:styleId="TOCLine2">
-    <w:name w:val="TOCLine2"/>
+  <w:style w:type="paragraph" w:customStyle="1" w:styleId="TOCK0">
+    <w:name w:val="TOCK0"/>
     <w:basedOn w:val="BodyText"/>
     <w:qFormat/>
   </w:style>
@@ -1860,7 +2179,7 @@
     </a:clrScheme>
     <a:fontScheme name="Office">
       <a:majorFont>
-        <a:latin typeface="Aptos Display" panose="02110004020202020204"/>
+        <a:latin typeface="Liberation Serif" panose="02110004020202020204"/>
         <a:ea typeface=""/>
         <a:cs typeface=""/>
         <a:font script="Jpan" typeface="游ゴシック Light"/>
@@ -1912,7 +2231,7 @@
         <a:font script="Tfng" typeface="Ebrima"/>
       </a:majorFont>
       <a:minorFont>
-        <a:latin typeface="Aptos" panose="02110004020202020204"/>
+        <a:latin typeface="Liberation Serif" panose="02110004020202020204"/>
         <a:ea typeface=""/>
         <a:cs typeface=""/>
         <a:font script="Jpan" typeface="游明朝"/>

</xml_diff>